<commit_message>
Masterworks Analytics Implementation Manager: score 78 after confirmations; profile adds GTM depth, DevTools debugging, pixels, UTM, consent
Co-Authored-By: Claude Opus 5.5 <noreply@anthropic.com>
Claude-Session: https://claude.ai/code/session_018DEej5NGjq1omj9BTtvEiy
</commit_message>
<xml_diff>
--- a/applications/masterworks-analytics-implementation-manager/Masterworks-AnalyticsImplementationManager-CoverLetter.docx
+++ b/applications/masterworks-analytics-implementation-manager/Masterworks-AnalyticsImplementationManager-CoverLetter.docx
@@ -94,7 +94,7 @@
           <w:b w:val="0"/>
           <w:color w:val="1A1A1A"/>
         </w:rPr>
-        <w:t>Your posting says this role is for someone who gets satisfaction from finding why a conversion event stopped firing. That's most of my week at Solenzo. I install Google Tag Manager and GA4 on every client site I build, connect forms and ad traffic to the CRM through webhooks and APIs, and then check that the data actually arrives. When it doesn't, I trace it through the payloads until I find the break.</w:t>
+        <w:t>Your posting says this role is for someone who gets satisfaction from finding why a conversion event stopped firing. That's most of my week at Solenzo. I deploy Google Tag Manager on every client site, build the triggers and variables for GA4 events, Meta Pixel, and Google Ads conversions, and debug in Preview mode and the browser's network tab and dataLayer when something doesn't fire. Then I check that the conversion actually lands in the CRM, tracing webhooks and API payloads until I find the break.</w:t>
       </w:r>
     </w:p>
     <w:p>
@@ -107,7 +107,7 @@
           <w:b w:val="0"/>
           <w:color w:val="1A1A1A"/>
         </w:rPr>
-        <w:t>The rest of the job looks familiar too. I've worked agency side at Level Agency and Fetch &amp; Funnel, holding several client accounts at once, and I document every client setup in Notion because I've seen what happens when that knowledge lives in one person's head. I write SQL against BigQuery/GA4, and I build AI and automation systems to monitor client workflows, which is the direction you describe for telemetry monitoring.</w:t>
+        <w:t>The rest of the job looks familiar too. I enforce UTM naming conventions for clients and set up cookie consent on their sites. I've worked agency side at Level Agency and Fetch &amp; Funnel holding several client accounts at once, and I document every client setup in Notion because I've seen what happens when that knowledge lives in one person's head. I write SQL against BigQuery/GA4, and I build AI and automation systems to monitor client workflows, the direction you describe for telemetry monitoring.</w:t>
       </w:r>
     </w:p>
     <w:p>

</xml_diff>